<commit_message>
Final report: update Section 9 with CI result and test timing
</commit_message>
<xml_diff>
--- a/docs/final-report/ServiceFlow_Final_Engineering_Report.docx
+++ b/docs/final-report/ServiceFlow_Final_Engineering_Report.docx
@@ -68,7 +68,16 @@
         <w:jc w:val="both"/>
       </w:pPr>
       <w:r>
-        <w:t>Customers of an internet service provider often cannot tell whether a connection problem is caused by their own equipment or by a wider outage, and support staff spend much of their time on repetitive first-line triage. ServiceFlow is a bounded, AI-assisted triage agent for that first step. It classifies the customer's problem, checks outage status through an approved read-only tool, answers from a controlled troubleshooting knowledge base with a cited source, and, when it cannot answer confidently, prepares a support ticket that a human must approve. It cannot change infrastructure, approve its own tickets or use any tool outside a fixed list.</w:t>
+        <w:t>Customers of an internet service provider often cannot tell whether a connection problem is caused by their own equipment or by a wider outage, and support staff spend much of their time on repetitive first-line triage. ServiceFlow is a bounded, AI-assisted triage agent for that first step. It classifies the customer's problem, checks outage status through an approved read-only tool, answers from a controlled troubleshooting knowledge base with a cited source, and, when it cannot answer confidently, prepares a support ticket that a human must approve. It cannot change infrastructure, approve its ow</w:t>
+      </w:r>
+      <w:r>
+        <w:rPr>
+          <w:lang w:val="en-US"/>
+        </w:rPr>
+        <w:t>t</w:t>
+      </w:r>
+      <w:r>
+        <w:t>n tickets or use any tool outside a fixed list.</w:t>
       </w:r>
     </w:p>
     <w:p>
@@ -157,12 +166,6 @@
         <w:gridCol w:w="4530"/>
       </w:tblGrid>
       <w:tr>
-        <w:tblPrEx>
-          <w:tblCellMar>
-            <w:top w:w="0" w:type="dxa"/>
-            <w:bottom w:w="0" w:type="dxa"/>
-          </w:tblCellMar>
-        </w:tblPrEx>
         <w:trPr>
           <w:cantSplit/>
         </w:trPr>
@@ -260,12 +263,6 @@
         </w:tc>
       </w:tr>
       <w:tr>
-        <w:tblPrEx>
-          <w:tblCellMar>
-            <w:top w:w="0" w:type="dxa"/>
-            <w:bottom w:w="0" w:type="dxa"/>
-          </w:tblCellMar>
-        </w:tblPrEx>
         <w:trPr>
           <w:cantSplit/>
         </w:trPr>
@@ -351,12 +348,6 @@
         </w:tc>
       </w:tr>
       <w:tr>
-        <w:tblPrEx>
-          <w:tblCellMar>
-            <w:top w:w="0" w:type="dxa"/>
-            <w:bottom w:w="0" w:type="dxa"/>
-          </w:tblCellMar>
-        </w:tblPrEx>
         <w:trPr>
           <w:cantSplit/>
         </w:trPr>
@@ -442,12 +433,6 @@
         </w:tc>
       </w:tr>
       <w:tr>
-        <w:tblPrEx>
-          <w:tblCellMar>
-            <w:top w:w="0" w:type="dxa"/>
-            <w:bottom w:w="0" w:type="dxa"/>
-          </w:tblCellMar>
-        </w:tblPrEx>
         <w:trPr>
           <w:cantSplit/>
         </w:trPr>
@@ -533,12 +518,6 @@
         </w:tc>
       </w:tr>
       <w:tr>
-        <w:tblPrEx>
-          <w:tblCellMar>
-            <w:top w:w="0" w:type="dxa"/>
-            <w:bottom w:w="0" w:type="dxa"/>
-          </w:tblCellMar>
-        </w:tblPrEx>
         <w:trPr>
           <w:cantSplit/>
         </w:trPr>
@@ -624,12 +603,6 @@
         </w:tc>
       </w:tr>
       <w:tr>
-        <w:tblPrEx>
-          <w:tblCellMar>
-            <w:top w:w="0" w:type="dxa"/>
-            <w:bottom w:w="0" w:type="dxa"/>
-          </w:tblCellMar>
-        </w:tblPrEx>
         <w:trPr>
           <w:cantSplit/>
         </w:trPr>
@@ -715,12 +688,6 @@
         </w:tc>
       </w:tr>
       <w:tr>
-        <w:tblPrEx>
-          <w:tblCellMar>
-            <w:top w:w="0" w:type="dxa"/>
-            <w:bottom w:w="0" w:type="dxa"/>
-          </w:tblCellMar>
-        </w:tblPrEx>
         <w:trPr>
           <w:cantSplit/>
         </w:trPr>
@@ -806,12 +773,6 @@
         </w:tc>
       </w:tr>
       <w:tr>
-        <w:tblPrEx>
-          <w:tblCellMar>
-            <w:top w:w="0" w:type="dxa"/>
-            <w:bottom w:w="0" w:type="dxa"/>
-          </w:tblCellMar>
-        </w:tblPrEx>
         <w:trPr>
           <w:cantSplit/>
         </w:trPr>
@@ -897,12 +858,6 @@
         </w:tc>
       </w:tr>
       <w:tr>
-        <w:tblPrEx>
-          <w:tblCellMar>
-            <w:top w:w="0" w:type="dxa"/>
-            <w:bottom w:w="0" w:type="dxa"/>
-          </w:tblCellMar>
-        </w:tblPrEx>
         <w:trPr>
           <w:cantSplit/>
         </w:trPr>
@@ -989,12 +944,6 @@
         </w:tc>
       </w:tr>
       <w:tr>
-        <w:tblPrEx>
-          <w:tblCellMar>
-            <w:top w:w="0" w:type="dxa"/>
-            <w:bottom w:w="0" w:type="dxa"/>
-          </w:tblCellMar>
-        </w:tblPrEx>
         <w:trPr>
           <w:cantSplit/>
         </w:trPr>
@@ -1080,12 +1029,6 @@
         </w:tc>
       </w:tr>
       <w:tr>
-        <w:tblPrEx>
-          <w:tblCellMar>
-            <w:top w:w="0" w:type="dxa"/>
-            <w:bottom w:w="0" w:type="dxa"/>
-          </w:tblCellMar>
-        </w:tblPrEx>
         <w:trPr>
           <w:cantSplit/>
         </w:trPr>
@@ -1171,12 +1114,6 @@
         </w:tc>
       </w:tr>
       <w:tr>
-        <w:tblPrEx>
-          <w:tblCellMar>
-            <w:top w:w="0" w:type="dxa"/>
-            <w:bottom w:w="0" w:type="dxa"/>
-          </w:tblCellMar>
-        </w:tblPrEx>
         <w:trPr>
           <w:cantSplit/>
         </w:trPr>
@@ -1262,12 +1199,6 @@
         </w:tc>
       </w:tr>
       <w:tr>
-        <w:tblPrEx>
-          <w:tblCellMar>
-            <w:top w:w="0" w:type="dxa"/>
-            <w:bottom w:w="0" w:type="dxa"/>
-          </w:tblCellMar>
-        </w:tblPrEx>
         <w:trPr>
           <w:cantSplit/>
         </w:trPr>
@@ -1536,12 +1467,6 @@
         <w:gridCol w:w="1200"/>
       </w:tblGrid>
       <w:tr>
-        <w:tblPrEx>
-          <w:tblCellMar>
-            <w:top w:w="0" w:type="dxa"/>
-            <w:bottom w:w="0" w:type="dxa"/>
-          </w:tblCellMar>
-        </w:tblPrEx>
         <w:trPr>
           <w:cantSplit/>
         </w:trPr>
@@ -1639,12 +1564,6 @@
         </w:tc>
       </w:tr>
       <w:tr>
-        <w:tblPrEx>
-          <w:tblCellMar>
-            <w:top w:w="0" w:type="dxa"/>
-            <w:bottom w:w="0" w:type="dxa"/>
-          </w:tblCellMar>
-        </w:tblPrEx>
         <w:trPr>
           <w:cantSplit/>
         </w:trPr>
@@ -1730,12 +1649,6 @@
         </w:tc>
       </w:tr>
       <w:tr>
-        <w:tblPrEx>
-          <w:tblCellMar>
-            <w:top w:w="0" w:type="dxa"/>
-            <w:bottom w:w="0" w:type="dxa"/>
-          </w:tblCellMar>
-        </w:tblPrEx>
         <w:trPr>
           <w:cantSplit/>
         </w:trPr>
@@ -1822,12 +1735,6 @@
         </w:tc>
       </w:tr>
       <w:tr>
-        <w:tblPrEx>
-          <w:tblCellMar>
-            <w:top w:w="0" w:type="dxa"/>
-            <w:bottom w:w="0" w:type="dxa"/>
-          </w:tblCellMar>
-        </w:tblPrEx>
         <w:trPr>
           <w:cantSplit/>
         </w:trPr>
@@ -1913,12 +1820,6 @@
         </w:tc>
       </w:tr>
       <w:tr>
-        <w:tblPrEx>
-          <w:tblCellMar>
-            <w:top w:w="0" w:type="dxa"/>
-            <w:bottom w:w="0" w:type="dxa"/>
-          </w:tblCellMar>
-        </w:tblPrEx>
         <w:trPr>
           <w:cantSplit/>
         </w:trPr>
@@ -2004,12 +1905,6 @@
         </w:tc>
       </w:tr>
       <w:tr>
-        <w:tblPrEx>
-          <w:tblCellMar>
-            <w:top w:w="0" w:type="dxa"/>
-            <w:bottom w:w="0" w:type="dxa"/>
-          </w:tblCellMar>
-        </w:tblPrEx>
         <w:trPr>
           <w:cantSplit/>
         </w:trPr>
@@ -2095,12 +1990,6 @@
         </w:tc>
       </w:tr>
       <w:tr>
-        <w:tblPrEx>
-          <w:tblCellMar>
-            <w:top w:w="0" w:type="dxa"/>
-            <w:bottom w:w="0" w:type="dxa"/>
-          </w:tblCellMar>
-        </w:tblPrEx>
         <w:trPr>
           <w:cantSplit/>
         </w:trPr>
@@ -2186,12 +2075,6 @@
         </w:tc>
       </w:tr>
       <w:tr>
-        <w:tblPrEx>
-          <w:tblCellMar>
-            <w:top w:w="0" w:type="dxa"/>
-            <w:bottom w:w="0" w:type="dxa"/>
-          </w:tblCellMar>
-        </w:tblPrEx>
         <w:trPr>
           <w:cantSplit/>
         </w:trPr>
@@ -2277,12 +2160,6 @@
         </w:tc>
       </w:tr>
       <w:tr>
-        <w:tblPrEx>
-          <w:tblCellMar>
-            <w:top w:w="0" w:type="dxa"/>
-            <w:bottom w:w="0" w:type="dxa"/>
-          </w:tblCellMar>
-        </w:tblPrEx>
         <w:trPr>
           <w:cantSplit/>
         </w:trPr>
@@ -2368,12 +2245,6 @@
         </w:tc>
       </w:tr>
       <w:tr>
-        <w:tblPrEx>
-          <w:tblCellMar>
-            <w:top w:w="0" w:type="dxa"/>
-            <w:bottom w:w="0" w:type="dxa"/>
-          </w:tblCellMar>
-        </w:tblPrEx>
         <w:trPr>
           <w:cantSplit/>
         </w:trPr>
@@ -2459,12 +2330,6 @@
         </w:tc>
       </w:tr>
       <w:tr>
-        <w:tblPrEx>
-          <w:tblCellMar>
-            <w:top w:w="0" w:type="dxa"/>
-            <w:bottom w:w="0" w:type="dxa"/>
-          </w:tblCellMar>
-        </w:tblPrEx>
         <w:trPr>
           <w:cantSplit/>
         </w:trPr>
@@ -2641,10 +2506,7 @@
         <w:t>not measured</w:t>
       </w:r>
       <w:r>
-        <w:t>. The live comparison was not run before submission, so this report makes no accuracy or latency claim for Gemini. The script that produces it (python src/gemini_eval.py) is included and is the first item under future work.</w:t>
-      </w:r>
-      <w:r>
-        <w:t>.</w:t>
+        <w:t>. The live comparison was not run before submission, so this report makes no accuracy or latency claim for Gemini. The script that produces it (python src/gemini_eval.py) is included and is the first item under future work..</w:t>
       </w:r>
       <w:r>
         <w:rPr>
@@ -2681,12 +2543,6 @@
         <w:gridCol w:w="2300"/>
       </w:tblGrid>
       <w:tr>
-        <w:tblPrEx>
-          <w:tblCellMar>
-            <w:top w:w="0" w:type="dxa"/>
-            <w:bottom w:w="0" w:type="dxa"/>
-          </w:tblCellMar>
-        </w:tblPrEx>
         <w:trPr>
           <w:cantSplit/>
         </w:trPr>
@@ -2784,12 +2640,6 @@
         </w:tc>
       </w:tr>
       <w:tr>
-        <w:tblPrEx>
-          <w:tblCellMar>
-            <w:top w:w="0" w:type="dxa"/>
-            <w:bottom w:w="0" w:type="dxa"/>
-          </w:tblCellMar>
-        </w:tblPrEx>
         <w:trPr>
           <w:cantSplit/>
         </w:trPr>
@@ -2876,12 +2726,6 @@
         </w:tc>
       </w:tr>
       <w:tr>
-        <w:tblPrEx>
-          <w:tblCellMar>
-            <w:top w:w="0" w:type="dxa"/>
-            <w:bottom w:w="0" w:type="dxa"/>
-          </w:tblCellMar>
-        </w:tblPrEx>
         <w:trPr>
           <w:cantSplit/>
         </w:trPr>
@@ -3042,12 +2886,6 @@
         <w:gridCol w:w="2450"/>
       </w:tblGrid>
       <w:tr>
-        <w:tblPrEx>
-          <w:tblCellMar>
-            <w:top w:w="0" w:type="dxa"/>
-            <w:bottom w:w="0" w:type="dxa"/>
-          </w:tblCellMar>
-        </w:tblPrEx>
         <w:trPr>
           <w:cantSplit/>
         </w:trPr>
@@ -3145,12 +2983,6 @@
         </w:tc>
       </w:tr>
       <w:tr>
-        <w:tblPrEx>
-          <w:tblCellMar>
-            <w:top w:w="0" w:type="dxa"/>
-            <w:bottom w:w="0" w:type="dxa"/>
-          </w:tblCellMar>
-        </w:tblPrEx>
         <w:trPr>
           <w:cantSplit/>
         </w:trPr>
@@ -3236,12 +3068,6 @@
         </w:tc>
       </w:tr>
       <w:tr>
-        <w:tblPrEx>
-          <w:tblCellMar>
-            <w:top w:w="0" w:type="dxa"/>
-            <w:bottom w:w="0" w:type="dxa"/>
-          </w:tblCellMar>
-        </w:tblPrEx>
         <w:trPr>
           <w:cantSplit/>
         </w:trPr>
@@ -3327,12 +3153,6 @@
         </w:tc>
       </w:tr>
       <w:tr>
-        <w:tblPrEx>
-          <w:tblCellMar>
-            <w:top w:w="0" w:type="dxa"/>
-            <w:bottom w:w="0" w:type="dxa"/>
-          </w:tblCellMar>
-        </w:tblPrEx>
         <w:trPr>
           <w:cantSplit/>
         </w:trPr>
@@ -3418,12 +3238,6 @@
         </w:tc>
       </w:tr>
       <w:tr>
-        <w:tblPrEx>
-          <w:tblCellMar>
-            <w:top w:w="0" w:type="dxa"/>
-            <w:bottom w:w="0" w:type="dxa"/>
-          </w:tblCellMar>
-        </w:tblPrEx>
         <w:trPr>
           <w:cantSplit/>
         </w:trPr>
@@ -3509,12 +3323,6 @@
         </w:tc>
       </w:tr>
       <w:tr>
-        <w:tblPrEx>
-          <w:tblCellMar>
-            <w:top w:w="0" w:type="dxa"/>
-            <w:bottom w:w="0" w:type="dxa"/>
-          </w:tblCellMar>
-        </w:tblPrEx>
         <w:trPr>
           <w:cantSplit/>
         </w:trPr>
@@ -3600,12 +3408,6 @@
         </w:tc>
       </w:tr>
       <w:tr>
-        <w:tblPrEx>
-          <w:tblCellMar>
-            <w:top w:w="0" w:type="dxa"/>
-            <w:bottom w:w="0" w:type="dxa"/>
-          </w:tblCellMar>
-        </w:tblPrEx>
         <w:trPr>
           <w:cantSplit/>
         </w:trPr>
@@ -3740,12 +3542,6 @@
         <w:gridCol w:w="2600"/>
       </w:tblGrid>
       <w:tr>
-        <w:tblPrEx>
-          <w:tblCellMar>
-            <w:top w:w="0" w:type="dxa"/>
-            <w:bottom w:w="0" w:type="dxa"/>
-          </w:tblCellMar>
-        </w:tblPrEx>
         <w:trPr>
           <w:cantSplit/>
         </w:trPr>
@@ -3843,12 +3639,6 @@
         </w:tc>
       </w:tr>
       <w:tr>
-        <w:tblPrEx>
-          <w:tblCellMar>
-            <w:top w:w="0" w:type="dxa"/>
-            <w:bottom w:w="0" w:type="dxa"/>
-          </w:tblCellMar>
-        </w:tblPrEx>
         <w:trPr>
           <w:cantSplit/>
         </w:trPr>
@@ -3934,12 +3724,6 @@
         </w:tc>
       </w:tr>
       <w:tr>
-        <w:tblPrEx>
-          <w:tblCellMar>
-            <w:top w:w="0" w:type="dxa"/>
-            <w:bottom w:w="0" w:type="dxa"/>
-          </w:tblCellMar>
-        </w:tblPrEx>
         <w:trPr>
           <w:cantSplit/>
         </w:trPr>
@@ -4025,12 +3809,6 @@
         </w:tc>
       </w:tr>
       <w:tr>
-        <w:tblPrEx>
-          <w:tblCellMar>
-            <w:top w:w="0" w:type="dxa"/>
-            <w:bottom w:w="0" w:type="dxa"/>
-          </w:tblCellMar>
-        </w:tblPrEx>
         <w:trPr>
           <w:cantSplit/>
         </w:trPr>
@@ -4163,12 +3941,6 @@
         <w:gridCol w:w="3600"/>
       </w:tblGrid>
       <w:tr>
-        <w:tblPrEx>
-          <w:tblCellMar>
-            <w:top w:w="0" w:type="dxa"/>
-            <w:bottom w:w="0" w:type="dxa"/>
-          </w:tblCellMar>
-        </w:tblPrEx>
         <w:trPr>
           <w:cantSplit/>
         </w:trPr>
@@ -4266,12 +4038,6 @@
         </w:tc>
       </w:tr>
       <w:tr>
-        <w:tblPrEx>
-          <w:tblCellMar>
-            <w:top w:w="0" w:type="dxa"/>
-            <w:bottom w:w="0" w:type="dxa"/>
-          </w:tblCellMar>
-        </w:tblPrEx>
         <w:trPr>
           <w:cantSplit/>
         </w:trPr>
@@ -4357,12 +4123,6 @@
         </w:tc>
       </w:tr>
       <w:tr>
-        <w:tblPrEx>
-          <w:tblCellMar>
-            <w:top w:w="0" w:type="dxa"/>
-            <w:bottom w:w="0" w:type="dxa"/>
-          </w:tblCellMar>
-        </w:tblPrEx>
         <w:trPr>
           <w:cantSplit/>
         </w:trPr>
@@ -4440,12 +4200,6 @@
         </w:tc>
       </w:tr>
       <w:tr>
-        <w:tblPrEx>
-          <w:tblCellMar>
-            <w:top w:w="0" w:type="dxa"/>
-            <w:bottom w:w="0" w:type="dxa"/>
-          </w:tblCellMar>
-        </w:tblPrEx>
         <w:trPr>
           <w:cantSplit/>
         </w:trPr>
@@ -4523,12 +4277,6 @@
         </w:tc>
       </w:tr>
       <w:tr>
-        <w:tblPrEx>
-          <w:tblCellMar>
-            <w:top w:w="0" w:type="dxa"/>
-            <w:bottom w:w="0" w:type="dxa"/>
-          </w:tblCellMar>
-        </w:tblPrEx>
         <w:trPr>
           <w:cantSplit/>
         </w:trPr>
@@ -4606,12 +4354,6 @@
         </w:tc>
       </w:tr>
       <w:tr>
-        <w:tblPrEx>
-          <w:tblCellMar>
-            <w:top w:w="0" w:type="dxa"/>
-            <w:bottom w:w="0" w:type="dxa"/>
-          </w:tblCellMar>
-        </w:tblPrEx>
         <w:trPr>
           <w:cantSplit/>
         </w:trPr>
@@ -4689,12 +4431,6 @@
         </w:tc>
       </w:tr>
       <w:tr>
-        <w:tblPrEx>
-          <w:tblCellMar>
-            <w:top w:w="0" w:type="dxa"/>
-            <w:bottom w:w="0" w:type="dxa"/>
-          </w:tblCellMar>
-        </w:tblPrEx>
         <w:trPr>
           <w:cantSplit/>
         </w:trPr>
@@ -4780,12 +4516,6 @@
         </w:tc>
       </w:tr>
       <w:tr>
-        <w:tblPrEx>
-          <w:tblCellMar>
-            <w:top w:w="0" w:type="dxa"/>
-            <w:bottom w:w="0" w:type="dxa"/>
-          </w:tblCellMar>
-        </w:tblPrEx>
         <w:trPr>
           <w:cantSplit/>
         </w:trPr>
@@ -4863,12 +4593,6 @@
         </w:tc>
       </w:tr>
       <w:tr>
-        <w:tblPrEx>
-          <w:tblCellMar>
-            <w:top w:w="0" w:type="dxa"/>
-            <w:bottom w:w="0" w:type="dxa"/>
-          </w:tblCellMar>
-        </w:tblPrEx>
         <w:trPr>
           <w:cantSplit/>
         </w:trPr>
@@ -4946,12 +4670,6 @@
         </w:tc>
       </w:tr>
       <w:tr>
-        <w:tblPrEx>
-          <w:tblCellMar>
-            <w:top w:w="0" w:type="dxa"/>
-            <w:bottom w:w="0" w:type="dxa"/>
-          </w:tblCellMar>
-        </w:tblPrEx>
         <w:trPr>
           <w:cantSplit/>
         </w:trPr>
@@ -5126,12 +4844,6 @@
         <w:gridCol w:w="1500"/>
       </w:tblGrid>
       <w:tr>
-        <w:tblPrEx>
-          <w:tblCellMar>
-            <w:top w:w="0" w:type="dxa"/>
-            <w:bottom w:w="0" w:type="dxa"/>
-          </w:tblCellMar>
-        </w:tblPrEx>
         <w:trPr>
           <w:cantSplit/>
         </w:trPr>
@@ -5252,12 +4964,6 @@
         </w:tc>
       </w:tr>
       <w:tr>
-        <w:tblPrEx>
-          <w:tblCellMar>
-            <w:top w:w="0" w:type="dxa"/>
-            <w:bottom w:w="0" w:type="dxa"/>
-          </w:tblCellMar>
-        </w:tblPrEx>
         <w:trPr>
           <w:cantSplit/>
         </w:trPr>
@@ -5363,12 +5069,6 @@
         </w:tc>
       </w:tr>
       <w:tr>
-        <w:tblPrEx>
-          <w:tblCellMar>
-            <w:top w:w="0" w:type="dxa"/>
-            <w:bottom w:w="0" w:type="dxa"/>
-          </w:tblCellMar>
-        </w:tblPrEx>
         <w:trPr>
           <w:cantSplit/>
         </w:trPr>
@@ -5474,12 +5174,6 @@
         </w:tc>
       </w:tr>
       <w:tr>
-        <w:tblPrEx>
-          <w:tblCellMar>
-            <w:top w:w="0" w:type="dxa"/>
-            <w:bottom w:w="0" w:type="dxa"/>
-          </w:tblCellMar>
-        </w:tblPrEx>
         <w:trPr>
           <w:cantSplit/>
         </w:trPr>
@@ -5585,12 +5279,6 @@
         </w:tc>
       </w:tr>
       <w:tr>
-        <w:tblPrEx>
-          <w:tblCellMar>
-            <w:top w:w="0" w:type="dxa"/>
-            <w:bottom w:w="0" w:type="dxa"/>
-          </w:tblCellMar>
-        </w:tblPrEx>
         <w:trPr>
           <w:cantSplit/>
         </w:trPr>
@@ -5808,12 +5496,6 @@
         <w:gridCol w:w="2500"/>
       </w:tblGrid>
       <w:tr>
-        <w:tblPrEx>
-          <w:tblCellMar>
-            <w:top w:w="0" w:type="dxa"/>
-            <w:bottom w:w="0" w:type="dxa"/>
-          </w:tblCellMar>
-        </w:tblPrEx>
         <w:trPr>
           <w:cantSplit/>
         </w:trPr>
@@ -5911,12 +5593,6 @@
         </w:tc>
       </w:tr>
       <w:tr>
-        <w:tblPrEx>
-          <w:tblCellMar>
-            <w:top w:w="0" w:type="dxa"/>
-            <w:bottom w:w="0" w:type="dxa"/>
-          </w:tblCellMar>
-        </w:tblPrEx>
         <w:trPr>
           <w:cantSplit/>
         </w:trPr>
@@ -6002,12 +5678,6 @@
         </w:tc>
       </w:tr>
       <w:tr>
-        <w:tblPrEx>
-          <w:tblCellMar>
-            <w:top w:w="0" w:type="dxa"/>
-            <w:bottom w:w="0" w:type="dxa"/>
-          </w:tblCellMar>
-        </w:tblPrEx>
         <w:trPr>
           <w:cantSplit/>
         </w:trPr>
@@ -6093,12 +5763,6 @@
         </w:tc>
       </w:tr>
       <w:tr>
-        <w:tblPrEx>
-          <w:tblCellMar>
-            <w:top w:w="0" w:type="dxa"/>
-            <w:bottom w:w="0" w:type="dxa"/>
-          </w:tblCellMar>
-        </w:tblPrEx>
         <w:trPr>
           <w:cantSplit/>
         </w:trPr>
@@ -6184,12 +5848,6 @@
         </w:tc>
       </w:tr>
       <w:tr>
-        <w:tblPrEx>
-          <w:tblCellMar>
-            <w:top w:w="0" w:type="dxa"/>
-            <w:bottom w:w="0" w:type="dxa"/>
-          </w:tblCellMar>
-        </w:tblPrEx>
         <w:trPr>
           <w:cantSplit/>
         </w:trPr>
@@ -6275,12 +5933,6 @@
         </w:tc>
       </w:tr>
       <w:tr>
-        <w:tblPrEx>
-          <w:tblCellMar>
-            <w:top w:w="0" w:type="dxa"/>
-            <w:bottom w:w="0" w:type="dxa"/>
-          </w:tblCellMar>
-        </w:tblPrEx>
         <w:trPr>
           <w:cantSplit/>
         </w:trPr>
@@ -6366,12 +6018,6 @@
         </w:tc>
       </w:tr>
       <w:tr>
-        <w:tblPrEx>
-          <w:tblCellMar>
-            <w:top w:w="0" w:type="dxa"/>
-            <w:bottom w:w="0" w:type="dxa"/>
-          </w:tblCellMar>
-        </w:tblPrEx>
         <w:trPr>
           <w:cantSplit/>
         </w:trPr>
@@ -6496,12 +6142,6 @@
         <w:gridCol w:w="2100"/>
       </w:tblGrid>
       <w:tr>
-        <w:tblPrEx>
-          <w:tblCellMar>
-            <w:top w:w="0" w:type="dxa"/>
-            <w:bottom w:w="0" w:type="dxa"/>
-          </w:tblCellMar>
-        </w:tblPrEx>
         <w:trPr>
           <w:cantSplit/>
         </w:trPr>
@@ -6599,12 +6239,6 @@
         </w:tc>
       </w:tr>
       <w:tr>
-        <w:tblPrEx>
-          <w:tblCellMar>
-            <w:top w:w="0" w:type="dxa"/>
-            <w:bottom w:w="0" w:type="dxa"/>
-          </w:tblCellMar>
-        </w:tblPrEx>
         <w:trPr>
           <w:cantSplit/>
         </w:trPr>
@@ -6690,12 +6324,6 @@
         </w:tc>
       </w:tr>
       <w:tr>
-        <w:tblPrEx>
-          <w:tblCellMar>
-            <w:top w:w="0" w:type="dxa"/>
-            <w:bottom w:w="0" w:type="dxa"/>
-          </w:tblCellMar>
-        </w:tblPrEx>
         <w:trPr>
           <w:cantSplit/>
         </w:trPr>
@@ -6781,12 +6409,6 @@
         </w:tc>
       </w:tr>
       <w:tr>
-        <w:tblPrEx>
-          <w:tblCellMar>
-            <w:top w:w="0" w:type="dxa"/>
-            <w:bottom w:w="0" w:type="dxa"/>
-          </w:tblCellMar>
-        </w:tblPrEx>
         <w:trPr>
           <w:cantSplit/>
         </w:trPr>
@@ -6872,12 +6494,6 @@
         </w:tc>
       </w:tr>
       <w:tr>
-        <w:tblPrEx>
-          <w:tblCellMar>
-            <w:top w:w="0" w:type="dxa"/>
-            <w:bottom w:w="0" w:type="dxa"/>
-          </w:tblCellMar>
-        </w:tblPrEx>
         <w:trPr>
           <w:cantSplit/>
         </w:trPr>
@@ -6963,12 +6579,6 @@
         </w:tc>
       </w:tr>
       <w:tr>
-        <w:tblPrEx>
-          <w:tblCellMar>
-            <w:top w:w="0" w:type="dxa"/>
-            <w:bottom w:w="0" w:type="dxa"/>
-          </w:tblCellMar>
-        </w:tblPrEx>
         <w:trPr>
           <w:cantSplit/>
         </w:trPr>
@@ -7054,12 +6664,6 @@
         </w:tc>
       </w:tr>
       <w:tr>
-        <w:tblPrEx>
-          <w:tblCellMar>
-            <w:top w:w="0" w:type="dxa"/>
-            <w:bottom w:w="0" w:type="dxa"/>
-          </w:tblCellMar>
-        </w:tblPrEx>
         <w:trPr>
           <w:cantSplit/>
         </w:trPr>
@@ -7145,12 +6749,6 @@
         </w:tc>
       </w:tr>
       <w:tr>
-        <w:tblPrEx>
-          <w:tblCellMar>
-            <w:top w:w="0" w:type="dxa"/>
-            <w:bottom w:w="0" w:type="dxa"/>
-          </w:tblCellMar>
-        </w:tblPrEx>
         <w:trPr>
           <w:cantSplit/>
         </w:trPr>
@@ -7297,12 +6895,6 @@
         <w:gridCol w:w="1600"/>
       </w:tblGrid>
       <w:tr>
-        <w:tblPrEx>
-          <w:tblCellMar>
-            <w:top w:w="0" w:type="dxa"/>
-            <w:bottom w:w="0" w:type="dxa"/>
-          </w:tblCellMar>
-        </w:tblPrEx>
         <w:trPr>
           <w:cantSplit/>
         </w:trPr>
@@ -7400,12 +6992,6 @@
         </w:tc>
       </w:tr>
       <w:tr>
-        <w:tblPrEx>
-          <w:tblCellMar>
-            <w:top w:w="0" w:type="dxa"/>
-            <w:bottom w:w="0" w:type="dxa"/>
-          </w:tblCellMar>
-        </w:tblPrEx>
         <w:trPr>
           <w:cantSplit/>
         </w:trPr>
@@ -7491,12 +7077,6 @@
         </w:tc>
       </w:tr>
       <w:tr>
-        <w:tblPrEx>
-          <w:tblCellMar>
-            <w:top w:w="0" w:type="dxa"/>
-            <w:bottom w:w="0" w:type="dxa"/>
-          </w:tblCellMar>
-        </w:tblPrEx>
         <w:trPr>
           <w:cantSplit/>
         </w:trPr>
@@ -7582,12 +7162,6 @@
         </w:tc>
       </w:tr>
       <w:tr>
-        <w:tblPrEx>
-          <w:tblCellMar>
-            <w:top w:w="0" w:type="dxa"/>
-            <w:bottom w:w="0" w:type="dxa"/>
-          </w:tblCellMar>
-        </w:tblPrEx>
         <w:trPr>
           <w:cantSplit/>
         </w:trPr>
@@ -7673,12 +7247,6 @@
         </w:tc>
       </w:tr>
       <w:tr>
-        <w:tblPrEx>
-          <w:tblCellMar>
-            <w:top w:w="0" w:type="dxa"/>
-            <w:bottom w:w="0" w:type="dxa"/>
-          </w:tblCellMar>
-        </w:tblPrEx>
         <w:trPr>
           <w:cantSplit/>
         </w:trPr>
@@ -7764,12 +7332,6 @@
         </w:tc>
       </w:tr>
       <w:tr>
-        <w:tblPrEx>
-          <w:tblCellMar>
-            <w:top w:w="0" w:type="dxa"/>
-            <w:bottom w:w="0" w:type="dxa"/>
-          </w:tblCellMar>
-        </w:tblPrEx>
         <w:trPr>
           <w:cantSplit/>
         </w:trPr>
@@ -7855,12 +7417,6 @@
         </w:tc>
       </w:tr>
       <w:tr>
-        <w:tblPrEx>
-          <w:tblCellMar>
-            <w:top w:w="0" w:type="dxa"/>
-            <w:bottom w:w="0" w:type="dxa"/>
-          </w:tblCellMar>
-        </w:tblPrEx>
         <w:trPr>
           <w:cantSplit/>
         </w:trPr>
@@ -7946,12 +7502,6 @@
         </w:tc>
       </w:tr>
       <w:tr>
-        <w:tblPrEx>
-          <w:tblCellMar>
-            <w:top w:w="0" w:type="dxa"/>
-            <w:bottom w:w="0" w:type="dxa"/>
-          </w:tblCellMar>
-        </w:tblPrEx>
         <w:trPr>
           <w:cantSplit/>
         </w:trPr>
@@ -8037,12 +7587,6 @@
         </w:tc>
       </w:tr>
       <w:tr>
-        <w:tblPrEx>
-          <w:tblCellMar>
-            <w:top w:w="0" w:type="dxa"/>
-            <w:bottom w:w="0" w:type="dxa"/>
-          </w:tblCellMar>
-        </w:tblPrEx>
         <w:trPr>
           <w:cantSplit/>
         </w:trPr>
@@ -8128,12 +7672,6 @@
         </w:tc>
       </w:tr>
       <w:tr>
-        <w:tblPrEx>
-          <w:tblCellMar>
-            <w:top w:w="0" w:type="dxa"/>
-            <w:bottom w:w="0" w:type="dxa"/>
-          </w:tblCellMar>
-        </w:tblPrEx>
         <w:trPr>
           <w:cantSplit/>
         </w:trPr>
@@ -8259,7 +7797,16 @@
         <w:jc w:val="both"/>
       </w:pPr>
       <w:r>
-        <w:t>Testing. The pytest suite has 79 tests: unit tests for the classifier (including every untrusted-output case), tools, agent, guardrails (with parametrised attack and benign inputs), memory and sessions; an end-to-end test that checks the trace stores no raw text; the real-SDK contract test; and two regression gates that re-run the development and held-out sets and fail if pass counts fall below 44/46 and 14/20 or any safety violation or crash appears. The suite runs offline in about two seconds.</w:t>
+        <w:t xml:space="preserve">Testing. The pytest suite has 79 tests: unit tests for the classifier (including every untrusted-output case), tools, agent, guardrails (with parametrised attack and benign inputs), memory and sessions; an end-to-end test that checks the trace stores no raw text; the real-SDK contract test; and two regression gates that re-run the development and held-out sets and fail if pass counts fall below 44/46 and 14/20 or any safety violation or crash appears. The suite runs offline in </w:t>
+      </w:r>
+      <w:r>
+        <w:rPr>
+          <w:lang w:val="en-US"/>
+        </w:rPr>
+        <w:t>under a minute</w:t>
+      </w:r>
+      <w:r>
+        <w:t>.</w:t>
       </w:r>
     </w:p>
     <w:tbl>
@@ -8285,12 +7832,6 @@
         <w:gridCol w:w="1200"/>
       </w:tblGrid>
       <w:tr>
-        <w:tblPrEx>
-          <w:tblCellMar>
-            <w:top w:w="0" w:type="dxa"/>
-            <w:bottom w:w="0" w:type="dxa"/>
-          </w:tblCellMar>
-        </w:tblPrEx>
         <w:trPr>
           <w:cantSplit/>
         </w:trPr>
@@ -8365,12 +7906,6 @@
         </w:tc>
       </w:tr>
       <w:tr>
-        <w:tblPrEx>
-          <w:tblCellMar>
-            <w:top w:w="0" w:type="dxa"/>
-            <w:bottom w:w="0" w:type="dxa"/>
-          </w:tblCellMar>
-        </w:tblPrEx>
         <w:trPr>
           <w:cantSplit/>
         </w:trPr>
@@ -8436,12 +7971,6 @@
         </w:tc>
       </w:tr>
       <w:tr>
-        <w:tblPrEx>
-          <w:tblCellMar>
-            <w:top w:w="0" w:type="dxa"/>
-            <w:bottom w:w="0" w:type="dxa"/>
-          </w:tblCellMar>
-        </w:tblPrEx>
         <w:trPr>
           <w:cantSplit/>
         </w:trPr>
@@ -8507,12 +8036,6 @@
         </w:tc>
       </w:tr>
       <w:tr>
-        <w:tblPrEx>
-          <w:tblCellMar>
-            <w:top w:w="0" w:type="dxa"/>
-            <w:bottom w:w="0" w:type="dxa"/>
-          </w:tblCellMar>
-        </w:tblPrEx>
         <w:trPr>
           <w:cantSplit/>
         </w:trPr>
@@ -8578,12 +8101,6 @@
         </w:tc>
       </w:tr>
       <w:tr>
-        <w:tblPrEx>
-          <w:tblCellMar>
-            <w:top w:w="0" w:type="dxa"/>
-            <w:bottom w:w="0" w:type="dxa"/>
-          </w:tblCellMar>
-        </w:tblPrEx>
         <w:trPr>
           <w:cantSplit/>
         </w:trPr>
@@ -8649,12 +8166,6 @@
         </w:tc>
       </w:tr>
       <w:tr>
-        <w:tblPrEx>
-          <w:tblCellMar>
-            <w:top w:w="0" w:type="dxa"/>
-            <w:bottom w:w="0" w:type="dxa"/>
-          </w:tblCellMar>
-        </w:tblPrEx>
         <w:trPr>
           <w:cantSplit/>
         </w:trPr>
@@ -8720,12 +8231,6 @@
         </w:tc>
       </w:tr>
       <w:tr>
-        <w:tblPrEx>
-          <w:tblCellMar>
-            <w:top w:w="0" w:type="dxa"/>
-            <w:bottom w:w="0" w:type="dxa"/>
-          </w:tblCellMar>
-        </w:tblPrEx>
         <w:trPr>
           <w:cantSplit/>
         </w:trPr>
@@ -8791,12 +8296,6 @@
         </w:tc>
       </w:tr>
       <w:tr>
-        <w:tblPrEx>
-          <w:tblCellMar>
-            <w:top w:w="0" w:type="dxa"/>
-            <w:bottom w:w="0" w:type="dxa"/>
-          </w:tblCellMar>
-        </w:tblPrEx>
         <w:trPr>
           <w:cantSplit/>
         </w:trPr>
@@ -8863,12 +8362,6 @@
         </w:tc>
       </w:tr>
       <w:tr>
-        <w:tblPrEx>
-          <w:tblCellMar>
-            <w:top w:w="0" w:type="dxa"/>
-            <w:bottom w:w="0" w:type="dxa"/>
-          </w:tblCellMar>
-        </w:tblPrEx>
         <w:trPr>
           <w:cantSplit/>
         </w:trPr>
@@ -9052,12 +8545,6 @@
         <w:gridCol w:w="2900"/>
       </w:tblGrid>
       <w:tr>
-        <w:tblPrEx>
-          <w:tblCellMar>
-            <w:top w:w="0" w:type="dxa"/>
-            <w:bottom w:w="0" w:type="dxa"/>
-          </w:tblCellMar>
-        </w:tblPrEx>
         <w:trPr>
           <w:cantSplit/>
         </w:trPr>
@@ -9132,12 +8619,6 @@
         </w:tc>
       </w:tr>
       <w:tr>
-        <w:tblPrEx>
-          <w:tblCellMar>
-            <w:top w:w="0" w:type="dxa"/>
-            <w:bottom w:w="0" w:type="dxa"/>
-          </w:tblCellMar>
-        </w:tblPrEx>
         <w:trPr>
           <w:cantSplit/>
         </w:trPr>
@@ -9203,12 +8684,6 @@
         </w:tc>
       </w:tr>
       <w:tr>
-        <w:tblPrEx>
-          <w:tblCellMar>
-            <w:top w:w="0" w:type="dxa"/>
-            <w:bottom w:w="0" w:type="dxa"/>
-          </w:tblCellMar>
-        </w:tblPrEx>
         <w:trPr>
           <w:cantSplit/>
         </w:trPr>
@@ -9274,12 +8749,6 @@
         </w:tc>
       </w:tr>
       <w:tr>
-        <w:tblPrEx>
-          <w:tblCellMar>
-            <w:top w:w="0" w:type="dxa"/>
-            <w:bottom w:w="0" w:type="dxa"/>
-          </w:tblCellMar>
-        </w:tblPrEx>
         <w:trPr>
           <w:cantSplit/>
         </w:trPr>
@@ -9346,12 +8815,6 @@
         </w:tc>
       </w:tr>
       <w:tr>
-        <w:tblPrEx>
-          <w:tblCellMar>
-            <w:top w:w="0" w:type="dxa"/>
-            <w:bottom w:w="0" w:type="dxa"/>
-          </w:tblCellMar>
-        </w:tblPrEx>
         <w:trPr>
           <w:cantSplit/>
         </w:trPr>
@@ -9417,12 +8880,6 @@
         </w:tc>
       </w:tr>
       <w:tr>
-        <w:tblPrEx>
-          <w:tblCellMar>
-            <w:top w:w="0" w:type="dxa"/>
-            <w:bottom w:w="0" w:type="dxa"/>
-          </w:tblCellMar>
-        </w:tblPrEx>
         <w:trPr>
           <w:cantSplit/>
         </w:trPr>
@@ -9488,12 +8945,6 @@
         </w:tc>
       </w:tr>
       <w:tr>
-        <w:tblPrEx>
-          <w:tblCellMar>
-            <w:top w:w="0" w:type="dxa"/>
-            <w:bottom w:w="0" w:type="dxa"/>
-          </w:tblCellMar>
-        </w:tblPrEx>
         <w:trPr>
           <w:cantSplit/>
         </w:trPr>
@@ -9730,12 +9181,6 @@
         <w:gridCol w:w="6500"/>
       </w:tblGrid>
       <w:tr>
-        <w:tblPrEx>
-          <w:tblCellMar>
-            <w:top w:w="0" w:type="dxa"/>
-            <w:bottom w:w="0" w:type="dxa"/>
-          </w:tblCellMar>
-        </w:tblPrEx>
         <w:trPr>
           <w:cantSplit/>
         </w:trPr>
@@ -9810,12 +9255,6 @@
         </w:tc>
       </w:tr>
       <w:tr>
-        <w:tblPrEx>
-          <w:tblCellMar>
-            <w:top w:w="0" w:type="dxa"/>
-            <w:bottom w:w="0" w:type="dxa"/>
-          </w:tblCellMar>
-        </w:tblPrEx>
         <w:trPr>
           <w:cantSplit/>
         </w:trPr>
@@ -9881,12 +9320,6 @@
         </w:tc>
       </w:tr>
       <w:tr>
-        <w:tblPrEx>
-          <w:tblCellMar>
-            <w:top w:w="0" w:type="dxa"/>
-            <w:bottom w:w="0" w:type="dxa"/>
-          </w:tblCellMar>
-        </w:tblPrEx>
         <w:trPr>
           <w:cantSplit/>
         </w:trPr>
@@ -9952,12 +9385,6 @@
         </w:tc>
       </w:tr>
       <w:tr>
-        <w:tblPrEx>
-          <w:tblCellMar>
-            <w:top w:w="0" w:type="dxa"/>
-            <w:bottom w:w="0" w:type="dxa"/>
-          </w:tblCellMar>
-        </w:tblPrEx>
         <w:trPr>
           <w:cantSplit/>
         </w:trPr>
@@ -10023,12 +9450,6 @@
         </w:tc>
       </w:tr>
       <w:tr>
-        <w:tblPrEx>
-          <w:tblCellMar>
-            <w:top w:w="0" w:type="dxa"/>
-            <w:bottom w:w="0" w:type="dxa"/>
-          </w:tblCellMar>
-        </w:tblPrEx>
         <w:trPr>
           <w:cantSplit/>
         </w:trPr>
@@ -10094,12 +9515,6 @@
         </w:tc>
       </w:tr>
       <w:tr>
-        <w:tblPrEx>
-          <w:tblCellMar>
-            <w:top w:w="0" w:type="dxa"/>
-            <w:bottom w:w="0" w:type="dxa"/>
-          </w:tblCellMar>
-        </w:tblPrEx>
         <w:trPr>
           <w:cantSplit/>
         </w:trPr>
@@ -10165,12 +9580,6 @@
         </w:tc>
       </w:tr>
       <w:tr>
-        <w:tblPrEx>
-          <w:tblCellMar>
-            <w:top w:w="0" w:type="dxa"/>
-            <w:bottom w:w="0" w:type="dxa"/>
-          </w:tblCellMar>
-        </w:tblPrEx>
         <w:trPr>
           <w:cantSplit/>
         </w:trPr>
@@ -10236,12 +9645,6 @@
         </w:tc>
       </w:tr>
       <w:tr>
-        <w:tblPrEx>
-          <w:tblCellMar>
-            <w:top w:w="0" w:type="dxa"/>
-            <w:bottom w:w="0" w:type="dxa"/>
-          </w:tblCellMar>
-        </w:tblPrEx>
         <w:trPr>
           <w:cantSplit/>
         </w:trPr>
@@ -10307,12 +9710,6 @@
         </w:tc>
       </w:tr>
       <w:tr>
-        <w:tblPrEx>
-          <w:tblCellMar>
-            <w:top w:w="0" w:type="dxa"/>
-            <w:bottom w:w="0" w:type="dxa"/>
-          </w:tblCellMar>
-        </w:tblPrEx>
         <w:trPr>
           <w:cantSplit/>
         </w:trPr>
@@ -10378,12 +9775,6 @@
         </w:tc>
       </w:tr>
       <w:tr>
-        <w:tblPrEx>
-          <w:tblCellMar>
-            <w:top w:w="0" w:type="dxa"/>
-            <w:bottom w:w="0" w:type="dxa"/>
-          </w:tblCellMar>
-        </w:tblPrEx>
         <w:trPr>
           <w:cantSplit/>
         </w:trPr>
@@ -10449,12 +9840,6 @@
         </w:tc>
       </w:tr>
       <w:tr>
-        <w:tblPrEx>
-          <w:tblCellMar>
-            <w:top w:w="0" w:type="dxa"/>
-            <w:bottom w:w="0" w:type="dxa"/>
-          </w:tblCellMar>
-        </w:tblPrEx>
         <w:trPr>
           <w:cantSplit/>
         </w:trPr>
@@ -10553,12 +9938,6 @@
         <w:gridCol w:w="4500"/>
       </w:tblGrid>
       <w:tr>
-        <w:tblPrEx>
-          <w:tblCellMar>
-            <w:top w:w="0" w:type="dxa"/>
-            <w:bottom w:w="0" w:type="dxa"/>
-          </w:tblCellMar>
-        </w:tblPrEx>
         <w:trPr>
           <w:cantSplit/>
         </w:trPr>
@@ -10633,12 +10012,6 @@
         </w:tc>
       </w:tr>
       <w:tr>
-        <w:tblPrEx>
-          <w:tblCellMar>
-            <w:top w:w="0" w:type="dxa"/>
-            <w:bottom w:w="0" w:type="dxa"/>
-          </w:tblCellMar>
-        </w:tblPrEx>
         <w:trPr>
           <w:cantSplit/>
         </w:trPr>
@@ -10704,12 +10077,6 @@
         </w:tc>
       </w:tr>
       <w:tr>
-        <w:tblPrEx>
-          <w:tblCellMar>
-            <w:top w:w="0" w:type="dxa"/>
-            <w:bottom w:w="0" w:type="dxa"/>
-          </w:tblCellMar>
-        </w:tblPrEx>
         <w:trPr>
           <w:cantSplit/>
         </w:trPr>
@@ -10775,12 +10142,6 @@
         </w:tc>
       </w:tr>
       <w:tr>
-        <w:tblPrEx>
-          <w:tblCellMar>
-            <w:top w:w="0" w:type="dxa"/>
-            <w:bottom w:w="0" w:type="dxa"/>
-          </w:tblCellMar>
-        </w:tblPrEx>
         <w:trPr>
           <w:cantSplit/>
         </w:trPr>
@@ -10846,12 +10207,6 @@
         </w:tc>
       </w:tr>
       <w:tr>
-        <w:tblPrEx>
-          <w:tblCellMar>
-            <w:top w:w="0" w:type="dxa"/>
-            <w:bottom w:w="0" w:type="dxa"/>
-          </w:tblCellMar>
-        </w:tblPrEx>
         <w:trPr>
           <w:cantSplit/>
         </w:trPr>
@@ -10917,12 +10272,6 @@
         </w:tc>
       </w:tr>
       <w:tr>
-        <w:tblPrEx>
-          <w:tblCellMar>
-            <w:top w:w="0" w:type="dxa"/>
-            <w:bottom w:w="0" w:type="dxa"/>
-          </w:tblCellMar>
-        </w:tblPrEx>
         <w:trPr>
           <w:cantSplit/>
         </w:trPr>
@@ -10988,12 +10337,6 @@
         </w:tc>
       </w:tr>
       <w:tr>
-        <w:tblPrEx>
-          <w:tblCellMar>
-            <w:top w:w="0" w:type="dxa"/>
-            <w:bottom w:w="0" w:type="dxa"/>
-          </w:tblCellMar>
-        </w:tblPrEx>
         <w:trPr>
           <w:cantSplit/>
         </w:trPr>
@@ -11059,12 +10402,6 @@
         </w:tc>
       </w:tr>
       <w:tr>
-        <w:tblPrEx>
-          <w:tblCellMar>
-            <w:top w:w="0" w:type="dxa"/>
-            <w:bottom w:w="0" w:type="dxa"/>
-          </w:tblCellMar>
-        </w:tblPrEx>
         <w:trPr>
           <w:cantSplit/>
         </w:trPr>
@@ -11214,12 +10551,6 @@
         <w:gridCol w:w="3700"/>
       </w:tblGrid>
       <w:tr>
-        <w:tblPrEx>
-          <w:tblCellMar>
-            <w:top w:w="0" w:type="dxa"/>
-            <w:bottom w:w="0" w:type="dxa"/>
-          </w:tblCellMar>
-        </w:tblPrEx>
         <w:trPr>
           <w:cantSplit/>
         </w:trPr>
@@ -11284,12 +10615,6 @@
         </w:tc>
       </w:tr>
       <w:tr>
-        <w:tblPrEx>
-          <w:tblCellMar>
-            <w:top w:w="0" w:type="dxa"/>
-            <w:bottom w:w="0" w:type="dxa"/>
-          </w:tblCellMar>
-        </w:tblPrEx>
         <w:trPr>
           <w:cantSplit/>
         </w:trPr>
@@ -11355,12 +10680,6 @@
         </w:tc>
       </w:tr>
       <w:tr>
-        <w:tblPrEx>
-          <w:tblCellMar>
-            <w:top w:w="0" w:type="dxa"/>
-            <w:bottom w:w="0" w:type="dxa"/>
-          </w:tblCellMar>
-        </w:tblPrEx>
         <w:trPr>
           <w:cantSplit/>
         </w:trPr>
@@ -11426,12 +10745,6 @@
         </w:tc>
       </w:tr>
       <w:tr>
-        <w:tblPrEx>
-          <w:tblCellMar>
-            <w:top w:w="0" w:type="dxa"/>
-            <w:bottom w:w="0" w:type="dxa"/>
-          </w:tblCellMar>
-        </w:tblPrEx>
         <w:trPr>
           <w:cantSplit/>
         </w:trPr>
@@ -11497,12 +10810,6 @@
         </w:tc>
       </w:tr>
       <w:tr>
-        <w:tblPrEx>
-          <w:tblCellMar>
-            <w:top w:w="0" w:type="dxa"/>
-            <w:bottom w:w="0" w:type="dxa"/>
-          </w:tblCellMar>
-        </w:tblPrEx>
         <w:trPr>
           <w:cantSplit/>
         </w:trPr>
@@ -11619,12 +10926,6 @@
         <w:gridCol w:w="1400"/>
       </w:tblGrid>
       <w:tr>
-        <w:tblPrEx>
-          <w:tblCellMar>
-            <w:top w:w="0" w:type="dxa"/>
-            <w:bottom w:w="0" w:type="dxa"/>
-          </w:tblCellMar>
-        </w:tblPrEx>
         <w:trPr>
           <w:cantSplit/>
         </w:trPr>
@@ -11745,12 +11046,6 @@
         </w:tc>
       </w:tr>
       <w:tr>
-        <w:tblPrEx>
-          <w:tblCellMar>
-            <w:top w:w="0" w:type="dxa"/>
-            <w:bottom w:w="0" w:type="dxa"/>
-          </w:tblCellMar>
-        </w:tblPrEx>
         <w:trPr>
           <w:cantSplit/>
         </w:trPr>
@@ -11856,12 +11151,6 @@
         </w:tc>
       </w:tr>
       <w:tr>
-        <w:tblPrEx>
-          <w:tblCellMar>
-            <w:top w:w="0" w:type="dxa"/>
-            <w:bottom w:w="0" w:type="dxa"/>
-          </w:tblCellMar>
-        </w:tblPrEx>
         <w:trPr>
           <w:cantSplit/>
         </w:trPr>
@@ -11967,12 +11256,6 @@
         </w:tc>
       </w:tr>
       <w:tr>
-        <w:tblPrEx>
-          <w:tblCellMar>
-            <w:top w:w="0" w:type="dxa"/>
-            <w:bottom w:w="0" w:type="dxa"/>
-          </w:tblCellMar>
-        </w:tblPrEx>
         <w:trPr>
           <w:cantSplit/>
         </w:trPr>
@@ -12078,12 +11361,6 @@
         </w:tc>
       </w:tr>
       <w:tr>
-        <w:tblPrEx>
-          <w:tblCellMar>
-            <w:top w:w="0" w:type="dxa"/>
-            <w:bottom w:w="0" w:type="dxa"/>
-          </w:tblCellMar>
-        </w:tblPrEx>
         <w:trPr>
           <w:cantSplit/>
         </w:trPr>
@@ -12189,12 +11466,6 @@
         </w:tc>
       </w:tr>
       <w:tr>
-        <w:tblPrEx>
-          <w:tblCellMar>
-            <w:top w:w="0" w:type="dxa"/>
-            <w:bottom w:w="0" w:type="dxa"/>
-          </w:tblCellMar>
-        </w:tblPrEx>
         <w:trPr>
           <w:cantSplit/>
         </w:trPr>
@@ -12300,12 +11571,6 @@
         </w:tc>
       </w:tr>
       <w:tr>
-        <w:tblPrEx>
-          <w:tblCellMar>
-            <w:top w:w="0" w:type="dxa"/>
-            <w:bottom w:w="0" w:type="dxa"/>
-          </w:tblCellMar>
-        </w:tblPrEx>
         <w:trPr>
           <w:cantSplit/>
         </w:trPr>
@@ -12411,12 +11676,6 @@
         </w:tc>
       </w:tr>
       <w:tr>
-        <w:tblPrEx>
-          <w:tblCellMar>
-            <w:top w:w="0" w:type="dxa"/>
-            <w:bottom w:w="0" w:type="dxa"/>
-          </w:tblCellMar>
-        </w:tblPrEx>
         <w:trPr>
           <w:cantSplit/>
         </w:trPr>
@@ -12522,12 +11781,6 @@
         </w:tc>
       </w:tr>
       <w:tr>
-        <w:tblPrEx>
-          <w:tblCellMar>
-            <w:top w:w="0" w:type="dxa"/>
-            <w:bottom w:w="0" w:type="dxa"/>
-          </w:tblCellMar>
-        </w:tblPrEx>
         <w:trPr>
           <w:cantSplit/>
         </w:trPr>
@@ -12633,12 +11886,6 @@
         </w:tc>
       </w:tr>
       <w:tr>
-        <w:tblPrEx>
-          <w:tblCellMar>
-            <w:top w:w="0" w:type="dxa"/>
-            <w:bottom w:w="0" w:type="dxa"/>
-          </w:tblCellMar>
-        </w:tblPrEx>
         <w:trPr>
           <w:cantSplit/>
         </w:trPr>
@@ -12744,12 +11991,6 @@
         </w:tc>
       </w:tr>
       <w:tr>
-        <w:tblPrEx>
-          <w:tblCellMar>
-            <w:top w:w="0" w:type="dxa"/>
-            <w:bottom w:w="0" w:type="dxa"/>
-          </w:tblCellMar>
-        </w:tblPrEx>
         <w:trPr>
           <w:cantSplit/>
         </w:trPr>
@@ -12855,12 +12096,6 @@
         </w:tc>
       </w:tr>
       <w:tr>
-        <w:tblPrEx>
-          <w:tblCellMar>
-            <w:top w:w="0" w:type="dxa"/>
-            <w:bottom w:w="0" w:type="dxa"/>
-          </w:tblCellMar>
-        </w:tblPrEx>
         <w:trPr>
           <w:cantSplit/>
         </w:trPr>
@@ -12966,12 +12201,6 @@
         </w:tc>
       </w:tr>
       <w:tr>
-        <w:tblPrEx>
-          <w:tblCellMar>
-            <w:top w:w="0" w:type="dxa"/>
-            <w:bottom w:w="0" w:type="dxa"/>
-          </w:tblCellMar>
-        </w:tblPrEx>
         <w:trPr>
           <w:cantSplit/>
         </w:trPr>
@@ -13077,12 +12306,6 @@
         </w:tc>
       </w:tr>
       <w:tr>
-        <w:tblPrEx>
-          <w:tblCellMar>
-            <w:top w:w="0" w:type="dxa"/>
-            <w:bottom w:w="0" w:type="dxa"/>
-          </w:tblCellMar>
-        </w:tblPrEx>
         <w:trPr>
           <w:cantSplit/>
         </w:trPr>
@@ -13188,12 +12411,6 @@
         </w:tc>
       </w:tr>
       <w:tr>
-        <w:tblPrEx>
-          <w:tblCellMar>
-            <w:top w:w="0" w:type="dxa"/>
-            <w:bottom w:w="0" w:type="dxa"/>
-          </w:tblCellMar>
-        </w:tblPrEx>
         <w:trPr>
           <w:cantSplit/>
         </w:trPr>
@@ -13299,12 +12516,6 @@
         </w:tc>
       </w:tr>
       <w:tr>
-        <w:tblPrEx>
-          <w:tblCellMar>
-            <w:top w:w="0" w:type="dxa"/>
-            <w:bottom w:w="0" w:type="dxa"/>
-          </w:tblCellMar>
-        </w:tblPrEx>
         <w:trPr>
           <w:cantSplit/>
         </w:trPr>
@@ -13410,12 +12621,6 @@
         </w:tc>
       </w:tr>
       <w:tr>
-        <w:tblPrEx>
-          <w:tblCellMar>
-            <w:top w:w="0" w:type="dxa"/>
-            <w:bottom w:w="0" w:type="dxa"/>
-          </w:tblCellMar>
-        </w:tblPrEx>
         <w:trPr>
           <w:cantSplit/>
         </w:trPr>
@@ -13521,12 +12726,6 @@
         </w:tc>
       </w:tr>
       <w:tr>
-        <w:tblPrEx>
-          <w:tblCellMar>
-            <w:top w:w="0" w:type="dxa"/>
-            <w:bottom w:w="0" w:type="dxa"/>
-          </w:tblCellMar>
-        </w:tblPrEx>
         <w:trPr>
           <w:cantSplit/>
         </w:trPr>
@@ -13632,12 +12831,6 @@
         </w:tc>
       </w:tr>
       <w:tr>
-        <w:tblPrEx>
-          <w:tblCellMar>
-            <w:top w:w="0" w:type="dxa"/>
-            <w:bottom w:w="0" w:type="dxa"/>
-          </w:tblCellMar>
-        </w:tblPrEx>
         <w:trPr>
           <w:cantSplit/>
         </w:trPr>
@@ -13743,12 +12936,6 @@
         </w:tc>
       </w:tr>
       <w:tr>
-        <w:tblPrEx>
-          <w:tblCellMar>
-            <w:top w:w="0" w:type="dxa"/>
-            <w:bottom w:w="0" w:type="dxa"/>
-          </w:tblCellMar>
-        </w:tblPrEx>
         <w:trPr>
           <w:cantSplit/>
         </w:trPr>
@@ -13854,12 +13041,6 @@
         </w:tc>
       </w:tr>
       <w:tr>
-        <w:tblPrEx>
-          <w:tblCellMar>
-            <w:top w:w="0" w:type="dxa"/>
-            <w:bottom w:w="0" w:type="dxa"/>
-          </w:tblCellMar>
-        </w:tblPrEx>
         <w:trPr>
           <w:cantSplit/>
         </w:trPr>
@@ -13965,12 +13146,6 @@
         </w:tc>
       </w:tr>
       <w:tr>
-        <w:tblPrEx>
-          <w:tblCellMar>
-            <w:top w:w="0" w:type="dxa"/>
-            <w:bottom w:w="0" w:type="dxa"/>
-          </w:tblCellMar>
-        </w:tblPrEx>
         <w:trPr>
           <w:cantSplit/>
         </w:trPr>
@@ -14076,12 +13251,6 @@
         </w:tc>
       </w:tr>
       <w:tr>
-        <w:tblPrEx>
-          <w:tblCellMar>
-            <w:top w:w="0" w:type="dxa"/>
-            <w:bottom w:w="0" w:type="dxa"/>
-          </w:tblCellMar>
-        </w:tblPrEx>
         <w:trPr>
           <w:cantSplit/>
         </w:trPr>
@@ -14187,12 +13356,6 @@
         </w:tc>
       </w:tr>
       <w:tr>
-        <w:tblPrEx>
-          <w:tblCellMar>
-            <w:top w:w="0" w:type="dxa"/>
-            <w:bottom w:w="0" w:type="dxa"/>
-          </w:tblCellMar>
-        </w:tblPrEx>
         <w:trPr>
           <w:cantSplit/>
         </w:trPr>
@@ -14298,12 +13461,6 @@
         </w:tc>
       </w:tr>
       <w:tr>
-        <w:tblPrEx>
-          <w:tblCellMar>
-            <w:top w:w="0" w:type="dxa"/>
-            <w:bottom w:w="0" w:type="dxa"/>
-          </w:tblCellMar>
-        </w:tblPrEx>
         <w:trPr>
           <w:cantSplit/>
         </w:trPr>
@@ -14409,12 +13566,6 @@
         </w:tc>
       </w:tr>
       <w:tr>
-        <w:tblPrEx>
-          <w:tblCellMar>
-            <w:top w:w="0" w:type="dxa"/>
-            <w:bottom w:w="0" w:type="dxa"/>
-          </w:tblCellMar>
-        </w:tblPrEx>
         <w:trPr>
           <w:cantSplit/>
         </w:trPr>
@@ -14520,12 +13671,6 @@
         </w:tc>
       </w:tr>
       <w:tr>
-        <w:tblPrEx>
-          <w:tblCellMar>
-            <w:top w:w="0" w:type="dxa"/>
-            <w:bottom w:w="0" w:type="dxa"/>
-          </w:tblCellMar>
-        </w:tblPrEx>
         <w:trPr>
           <w:cantSplit/>
         </w:trPr>
@@ -14631,12 +13776,6 @@
         </w:tc>
       </w:tr>
       <w:tr>
-        <w:tblPrEx>
-          <w:tblCellMar>
-            <w:top w:w="0" w:type="dxa"/>
-            <w:bottom w:w="0" w:type="dxa"/>
-          </w:tblCellMar>
-        </w:tblPrEx>
         <w:trPr>
           <w:cantSplit/>
         </w:trPr>
@@ -14742,12 +13881,6 @@
         </w:tc>
       </w:tr>
       <w:tr>
-        <w:tblPrEx>
-          <w:tblCellMar>
-            <w:top w:w="0" w:type="dxa"/>
-            <w:bottom w:w="0" w:type="dxa"/>
-          </w:tblCellMar>
-        </w:tblPrEx>
         <w:trPr>
           <w:cantSplit/>
         </w:trPr>
@@ -14853,12 +13986,6 @@
         </w:tc>
       </w:tr>
       <w:tr>
-        <w:tblPrEx>
-          <w:tblCellMar>
-            <w:top w:w="0" w:type="dxa"/>
-            <w:bottom w:w="0" w:type="dxa"/>
-          </w:tblCellMar>
-        </w:tblPrEx>
         <w:trPr>
           <w:cantSplit/>
         </w:trPr>
@@ -14964,12 +14091,6 @@
         </w:tc>
       </w:tr>
       <w:tr>
-        <w:tblPrEx>
-          <w:tblCellMar>
-            <w:top w:w="0" w:type="dxa"/>
-            <w:bottom w:w="0" w:type="dxa"/>
-          </w:tblCellMar>
-        </w:tblPrEx>
         <w:trPr>
           <w:cantSplit/>
         </w:trPr>
@@ -15075,12 +14196,6 @@
         </w:tc>
       </w:tr>
       <w:tr>
-        <w:tblPrEx>
-          <w:tblCellMar>
-            <w:top w:w="0" w:type="dxa"/>
-            <w:bottom w:w="0" w:type="dxa"/>
-          </w:tblCellMar>
-        </w:tblPrEx>
         <w:trPr>
           <w:cantSplit/>
         </w:trPr>
@@ -15186,12 +14301,6 @@
         </w:tc>
       </w:tr>
       <w:tr>
-        <w:tblPrEx>
-          <w:tblCellMar>
-            <w:top w:w="0" w:type="dxa"/>
-            <w:bottom w:w="0" w:type="dxa"/>
-          </w:tblCellMar>
-        </w:tblPrEx>
         <w:trPr>
           <w:cantSplit/>
         </w:trPr>
@@ -15297,12 +14406,6 @@
         </w:tc>
       </w:tr>
       <w:tr>
-        <w:tblPrEx>
-          <w:tblCellMar>
-            <w:top w:w="0" w:type="dxa"/>
-            <w:bottom w:w="0" w:type="dxa"/>
-          </w:tblCellMar>
-        </w:tblPrEx>
         <w:trPr>
           <w:cantSplit/>
         </w:trPr>
@@ -15408,12 +14511,6 @@
         </w:tc>
       </w:tr>
       <w:tr>
-        <w:tblPrEx>
-          <w:tblCellMar>
-            <w:top w:w="0" w:type="dxa"/>
-            <w:bottom w:w="0" w:type="dxa"/>
-          </w:tblCellMar>
-        </w:tblPrEx>
         <w:trPr>
           <w:cantSplit/>
         </w:trPr>
@@ -15519,12 +14616,6 @@
         </w:tc>
       </w:tr>
       <w:tr>
-        <w:tblPrEx>
-          <w:tblCellMar>
-            <w:top w:w="0" w:type="dxa"/>
-            <w:bottom w:w="0" w:type="dxa"/>
-          </w:tblCellMar>
-        </w:tblPrEx>
         <w:trPr>
           <w:cantSplit/>
         </w:trPr>
@@ -15630,12 +14721,6 @@
         </w:tc>
       </w:tr>
       <w:tr>
-        <w:tblPrEx>
-          <w:tblCellMar>
-            <w:top w:w="0" w:type="dxa"/>
-            <w:bottom w:w="0" w:type="dxa"/>
-          </w:tblCellMar>
-        </w:tblPrEx>
         <w:trPr>
           <w:cantSplit/>
         </w:trPr>
@@ -15741,12 +14826,6 @@
         </w:tc>
       </w:tr>
       <w:tr>
-        <w:tblPrEx>
-          <w:tblCellMar>
-            <w:top w:w="0" w:type="dxa"/>
-            <w:bottom w:w="0" w:type="dxa"/>
-          </w:tblCellMar>
-        </w:tblPrEx>
         <w:trPr>
           <w:cantSplit/>
         </w:trPr>
@@ -15852,12 +14931,6 @@
         </w:tc>
       </w:tr>
       <w:tr>
-        <w:tblPrEx>
-          <w:tblCellMar>
-            <w:top w:w="0" w:type="dxa"/>
-            <w:bottom w:w="0" w:type="dxa"/>
-          </w:tblCellMar>
-        </w:tblPrEx>
         <w:trPr>
           <w:cantSplit/>
         </w:trPr>
@@ -15963,12 +15036,6 @@
         </w:tc>
       </w:tr>
       <w:tr>
-        <w:tblPrEx>
-          <w:tblCellMar>
-            <w:top w:w="0" w:type="dxa"/>
-            <w:bottom w:w="0" w:type="dxa"/>
-          </w:tblCellMar>
-        </w:tblPrEx>
         <w:trPr>
           <w:cantSplit/>
         </w:trPr>
@@ -16074,12 +15141,6 @@
         </w:tc>
       </w:tr>
       <w:tr>
-        <w:tblPrEx>
-          <w:tblCellMar>
-            <w:top w:w="0" w:type="dxa"/>
-            <w:bottom w:w="0" w:type="dxa"/>
-          </w:tblCellMar>
-        </w:tblPrEx>
         <w:trPr>
           <w:cantSplit/>
         </w:trPr>
@@ -16185,12 +15246,6 @@
         </w:tc>
       </w:tr>
       <w:tr>
-        <w:tblPrEx>
-          <w:tblCellMar>
-            <w:top w:w="0" w:type="dxa"/>
-            <w:bottom w:w="0" w:type="dxa"/>
-          </w:tblCellMar>
-        </w:tblPrEx>
         <w:trPr>
           <w:cantSplit/>
         </w:trPr>
@@ -16296,12 +15351,6 @@
         </w:tc>
       </w:tr>
       <w:tr>
-        <w:tblPrEx>
-          <w:tblCellMar>
-            <w:top w:w="0" w:type="dxa"/>
-            <w:bottom w:w="0" w:type="dxa"/>
-          </w:tblCellMar>
-        </w:tblPrEx>
         <w:trPr>
           <w:cantSplit/>
         </w:trPr>
@@ -16407,12 +15456,6 @@
         </w:tc>
       </w:tr>
       <w:tr>
-        <w:tblPrEx>
-          <w:tblCellMar>
-            <w:top w:w="0" w:type="dxa"/>
-            <w:bottom w:w="0" w:type="dxa"/>
-          </w:tblCellMar>
-        </w:tblPrEx>
         <w:trPr>
           <w:cantSplit/>
         </w:trPr>
@@ -16518,12 +15561,6 @@
         </w:tc>
       </w:tr>
       <w:tr>
-        <w:tblPrEx>
-          <w:tblCellMar>
-            <w:top w:w="0" w:type="dxa"/>
-            <w:bottom w:w="0" w:type="dxa"/>
-          </w:tblCellMar>
-        </w:tblPrEx>
         <w:trPr>
           <w:cantSplit/>
         </w:trPr>
@@ -16629,12 +15666,6 @@
         </w:tc>
       </w:tr>
       <w:tr>
-        <w:tblPrEx>
-          <w:tblCellMar>
-            <w:top w:w="0" w:type="dxa"/>
-            <w:bottom w:w="0" w:type="dxa"/>
-          </w:tblCellMar>
-        </w:tblPrEx>
         <w:trPr>
           <w:cantSplit/>
         </w:trPr>
@@ -16740,12 +15771,6 @@
         </w:tc>
       </w:tr>
       <w:tr>
-        <w:tblPrEx>
-          <w:tblCellMar>
-            <w:top w:w="0" w:type="dxa"/>
-            <w:bottom w:w="0" w:type="dxa"/>
-          </w:tblCellMar>
-        </w:tblPrEx>
         <w:trPr>
           <w:cantSplit/>
         </w:trPr>
@@ -16896,12 +15921,6 @@
         <w:gridCol w:w="1600"/>
       </w:tblGrid>
       <w:tr>
-        <w:tblPrEx>
-          <w:tblCellMar>
-            <w:top w:w="0" w:type="dxa"/>
-            <w:bottom w:w="0" w:type="dxa"/>
-          </w:tblCellMar>
-        </w:tblPrEx>
         <w:trPr>
           <w:cantSplit/>
         </w:trPr>
@@ -17022,12 +16041,6 @@
         </w:tc>
       </w:tr>
       <w:tr>
-        <w:tblPrEx>
-          <w:tblCellMar>
-            <w:top w:w="0" w:type="dxa"/>
-            <w:bottom w:w="0" w:type="dxa"/>
-          </w:tblCellMar>
-        </w:tblPrEx>
         <w:trPr>
           <w:cantSplit/>
         </w:trPr>
@@ -17133,12 +16146,6 @@
         </w:tc>
       </w:tr>
       <w:tr>
-        <w:tblPrEx>
-          <w:tblCellMar>
-            <w:top w:w="0" w:type="dxa"/>
-            <w:bottom w:w="0" w:type="dxa"/>
-          </w:tblCellMar>
-        </w:tblPrEx>
         <w:trPr>
           <w:cantSplit/>
         </w:trPr>
@@ -17245,12 +16252,6 @@
         </w:tc>
       </w:tr>
       <w:tr>
-        <w:tblPrEx>
-          <w:tblCellMar>
-            <w:top w:w="0" w:type="dxa"/>
-            <w:bottom w:w="0" w:type="dxa"/>
-          </w:tblCellMar>
-        </w:tblPrEx>
         <w:trPr>
           <w:cantSplit/>
         </w:trPr>
@@ -17356,12 +16357,6 @@
         </w:tc>
       </w:tr>
       <w:tr>
-        <w:tblPrEx>
-          <w:tblCellMar>
-            <w:top w:w="0" w:type="dxa"/>
-            <w:bottom w:w="0" w:type="dxa"/>
-          </w:tblCellMar>
-        </w:tblPrEx>
         <w:trPr>
           <w:cantSplit/>
         </w:trPr>
@@ -17467,12 +16462,6 @@
         </w:tc>
       </w:tr>
       <w:tr>
-        <w:tblPrEx>
-          <w:tblCellMar>
-            <w:top w:w="0" w:type="dxa"/>
-            <w:bottom w:w="0" w:type="dxa"/>
-          </w:tblCellMar>
-        </w:tblPrEx>
         <w:trPr>
           <w:cantSplit/>
         </w:trPr>
@@ -17578,12 +16567,6 @@
         </w:tc>
       </w:tr>
       <w:tr>
-        <w:tblPrEx>
-          <w:tblCellMar>
-            <w:top w:w="0" w:type="dxa"/>
-            <w:bottom w:w="0" w:type="dxa"/>
-          </w:tblCellMar>
-        </w:tblPrEx>
         <w:trPr>
           <w:cantSplit/>
         </w:trPr>
@@ -17689,12 +16672,6 @@
         </w:tc>
       </w:tr>
       <w:tr>
-        <w:tblPrEx>
-          <w:tblCellMar>
-            <w:top w:w="0" w:type="dxa"/>
-            <w:bottom w:w="0" w:type="dxa"/>
-          </w:tblCellMar>
-        </w:tblPrEx>
         <w:trPr>
           <w:cantSplit/>
         </w:trPr>
@@ -17800,12 +16777,6 @@
         </w:tc>
       </w:tr>
       <w:tr>
-        <w:tblPrEx>
-          <w:tblCellMar>
-            <w:top w:w="0" w:type="dxa"/>
-            <w:bottom w:w="0" w:type="dxa"/>
-          </w:tblCellMar>
-        </w:tblPrEx>
         <w:trPr>
           <w:cantSplit/>
         </w:trPr>
@@ -17911,12 +16882,6 @@
         </w:tc>
       </w:tr>
       <w:tr>
-        <w:tblPrEx>
-          <w:tblCellMar>
-            <w:top w:w="0" w:type="dxa"/>
-            <w:bottom w:w="0" w:type="dxa"/>
-          </w:tblCellMar>
-        </w:tblPrEx>
         <w:trPr>
           <w:cantSplit/>
         </w:trPr>
@@ -18022,12 +16987,6 @@
         </w:tc>
       </w:tr>
       <w:tr>
-        <w:tblPrEx>
-          <w:tblCellMar>
-            <w:top w:w="0" w:type="dxa"/>
-            <w:bottom w:w="0" w:type="dxa"/>
-          </w:tblCellMar>
-        </w:tblPrEx>
         <w:trPr>
           <w:cantSplit/>
         </w:trPr>
@@ -18133,12 +17092,6 @@
         </w:tc>
       </w:tr>
       <w:tr>
-        <w:tblPrEx>
-          <w:tblCellMar>
-            <w:top w:w="0" w:type="dxa"/>
-            <w:bottom w:w="0" w:type="dxa"/>
-          </w:tblCellMar>
-        </w:tblPrEx>
         <w:trPr>
           <w:cantSplit/>
         </w:trPr>
@@ -18244,12 +17197,6 @@
         </w:tc>
       </w:tr>
       <w:tr>
-        <w:tblPrEx>
-          <w:tblCellMar>
-            <w:top w:w="0" w:type="dxa"/>
-            <w:bottom w:w="0" w:type="dxa"/>
-          </w:tblCellMar>
-        </w:tblPrEx>
         <w:trPr>
           <w:cantSplit/>
         </w:trPr>
@@ -18355,12 +17302,6 @@
         </w:tc>
       </w:tr>
       <w:tr>
-        <w:tblPrEx>
-          <w:tblCellMar>
-            <w:top w:w="0" w:type="dxa"/>
-            <w:bottom w:w="0" w:type="dxa"/>
-          </w:tblCellMar>
-        </w:tblPrEx>
         <w:trPr>
           <w:cantSplit/>
         </w:trPr>
@@ -18466,12 +17407,6 @@
         </w:tc>
       </w:tr>
       <w:tr>
-        <w:tblPrEx>
-          <w:tblCellMar>
-            <w:top w:w="0" w:type="dxa"/>
-            <w:bottom w:w="0" w:type="dxa"/>
-          </w:tblCellMar>
-        </w:tblPrEx>
         <w:trPr>
           <w:cantSplit/>
         </w:trPr>
@@ -18577,12 +17512,6 @@
         </w:tc>
       </w:tr>
       <w:tr>
-        <w:tblPrEx>
-          <w:tblCellMar>
-            <w:top w:w="0" w:type="dxa"/>
-            <w:bottom w:w="0" w:type="dxa"/>
-          </w:tblCellMar>
-        </w:tblPrEx>
         <w:trPr>
           <w:cantSplit/>
         </w:trPr>
@@ -18688,12 +17617,6 @@
         </w:tc>
       </w:tr>
       <w:tr>
-        <w:tblPrEx>
-          <w:tblCellMar>
-            <w:top w:w="0" w:type="dxa"/>
-            <w:bottom w:w="0" w:type="dxa"/>
-          </w:tblCellMar>
-        </w:tblPrEx>
         <w:trPr>
           <w:cantSplit/>
         </w:trPr>
@@ -18799,12 +17722,6 @@
         </w:tc>
       </w:tr>
       <w:tr>
-        <w:tblPrEx>
-          <w:tblCellMar>
-            <w:top w:w="0" w:type="dxa"/>
-            <w:bottom w:w="0" w:type="dxa"/>
-          </w:tblCellMar>
-        </w:tblPrEx>
         <w:trPr>
           <w:cantSplit/>
         </w:trPr>
@@ -18910,12 +17827,6 @@
         </w:tc>
       </w:tr>
       <w:tr>
-        <w:tblPrEx>
-          <w:tblCellMar>
-            <w:top w:w="0" w:type="dxa"/>
-            <w:bottom w:w="0" w:type="dxa"/>
-          </w:tblCellMar>
-        </w:tblPrEx>
         <w:trPr>
           <w:cantSplit/>
         </w:trPr>
@@ -19021,12 +17932,6 @@
         </w:tc>
       </w:tr>
       <w:tr>
-        <w:tblPrEx>
-          <w:tblCellMar>
-            <w:top w:w="0" w:type="dxa"/>
-            <w:bottom w:w="0" w:type="dxa"/>
-          </w:tblCellMar>
-        </w:tblPrEx>
         <w:trPr>
           <w:cantSplit/>
         </w:trPr>
@@ -19132,12 +18037,6 @@
         </w:tc>
       </w:tr>
       <w:tr>
-        <w:tblPrEx>
-          <w:tblCellMar>
-            <w:top w:w="0" w:type="dxa"/>
-            <w:bottom w:w="0" w:type="dxa"/>
-          </w:tblCellMar>
-        </w:tblPrEx>
         <w:trPr>
           <w:cantSplit/>
         </w:trPr>
@@ -19277,12 +18176,6 @@
         <w:gridCol w:w="2500"/>
       </w:tblGrid>
       <w:tr>
-        <w:tblPrEx>
-          <w:tblCellMar>
-            <w:top w:w="0" w:type="dxa"/>
-            <w:bottom w:w="0" w:type="dxa"/>
-          </w:tblCellMar>
-        </w:tblPrEx>
         <w:trPr>
           <w:cantSplit/>
         </w:trPr>
@@ -19380,12 +18273,6 @@
         </w:tc>
       </w:tr>
       <w:tr>
-        <w:tblPrEx>
-          <w:tblCellMar>
-            <w:top w:w="0" w:type="dxa"/>
-            <w:bottom w:w="0" w:type="dxa"/>
-          </w:tblCellMar>
-        </w:tblPrEx>
         <w:trPr>
           <w:cantSplit/>
         </w:trPr>
@@ -19471,12 +18358,6 @@
         </w:tc>
       </w:tr>
       <w:tr>
-        <w:tblPrEx>
-          <w:tblCellMar>
-            <w:top w:w="0" w:type="dxa"/>
-            <w:bottom w:w="0" w:type="dxa"/>
-          </w:tblCellMar>
-        </w:tblPrEx>
         <w:trPr>
           <w:cantSplit/>
         </w:trPr>
@@ -19562,12 +18443,6 @@
         </w:tc>
       </w:tr>
       <w:tr>
-        <w:tblPrEx>
-          <w:tblCellMar>
-            <w:top w:w="0" w:type="dxa"/>
-            <w:bottom w:w="0" w:type="dxa"/>
-          </w:tblCellMar>
-        </w:tblPrEx>
         <w:trPr>
           <w:cantSplit/>
         </w:trPr>
@@ -19653,12 +18528,6 @@
         </w:tc>
       </w:tr>
       <w:tr>
-        <w:tblPrEx>
-          <w:tblCellMar>
-            <w:top w:w="0" w:type="dxa"/>
-            <w:bottom w:w="0" w:type="dxa"/>
-          </w:tblCellMar>
-        </w:tblPrEx>
         <w:trPr>
           <w:cantSplit/>
         </w:trPr>
@@ -19744,12 +18613,6 @@
         </w:tc>
       </w:tr>
       <w:tr>
-        <w:tblPrEx>
-          <w:tblCellMar>
-            <w:top w:w="0" w:type="dxa"/>
-            <w:bottom w:w="0" w:type="dxa"/>
-          </w:tblCellMar>
-        </w:tblPrEx>
         <w:trPr>
           <w:cantSplit/>
         </w:trPr>
@@ -19835,12 +18698,6 @@
         </w:tc>
       </w:tr>
       <w:tr>
-        <w:tblPrEx>
-          <w:tblCellMar>
-            <w:top w:w="0" w:type="dxa"/>
-            <w:bottom w:w="0" w:type="dxa"/>
-          </w:tblCellMar>
-        </w:tblPrEx>
         <w:trPr>
           <w:cantSplit/>
         </w:trPr>
@@ -19926,12 +18783,6 @@
         </w:tc>
       </w:tr>
       <w:tr>
-        <w:tblPrEx>
-          <w:tblCellMar>
-            <w:top w:w="0" w:type="dxa"/>
-            <w:bottom w:w="0" w:type="dxa"/>
-          </w:tblCellMar>
-        </w:tblPrEx>
         <w:trPr>
           <w:cantSplit/>
         </w:trPr>
@@ -20017,12 +18868,6 @@
         </w:tc>
       </w:tr>
       <w:tr>
-        <w:tblPrEx>
-          <w:tblCellMar>
-            <w:top w:w="0" w:type="dxa"/>
-            <w:bottom w:w="0" w:type="dxa"/>
-          </w:tblCellMar>
-        </w:tblPrEx>
         <w:trPr>
           <w:cantSplit/>
         </w:trPr>
@@ -20108,12 +18953,6 @@
         </w:tc>
       </w:tr>
       <w:tr>
-        <w:tblPrEx>
-          <w:tblCellMar>
-            <w:top w:w="0" w:type="dxa"/>
-            <w:bottom w:w="0" w:type="dxa"/>
-          </w:tblCellMar>
-        </w:tblPrEx>
         <w:trPr>
           <w:cantSplit/>
         </w:trPr>
@@ -20199,12 +19038,6 @@
         </w:tc>
       </w:tr>
       <w:tr>
-        <w:tblPrEx>
-          <w:tblCellMar>
-            <w:top w:w="0" w:type="dxa"/>
-            <w:bottom w:w="0" w:type="dxa"/>
-          </w:tblCellMar>
-        </w:tblPrEx>
         <w:trPr>
           <w:cantSplit/>
         </w:trPr>
@@ -20290,12 +19123,6 @@
         </w:tc>
       </w:tr>
       <w:tr>
-        <w:tblPrEx>
-          <w:tblCellMar>
-            <w:top w:w="0" w:type="dxa"/>
-            <w:bottom w:w="0" w:type="dxa"/>
-          </w:tblCellMar>
-        </w:tblPrEx>
         <w:trPr>
           <w:cantSplit/>
         </w:trPr>
@@ -20381,12 +19208,6 @@
         </w:tc>
       </w:tr>
       <w:tr>
-        <w:tblPrEx>
-          <w:tblCellMar>
-            <w:top w:w="0" w:type="dxa"/>
-            <w:bottom w:w="0" w:type="dxa"/>
-          </w:tblCellMar>
-        </w:tblPrEx>
         <w:trPr>
           <w:cantSplit/>
         </w:trPr>
@@ -20472,12 +19293,6 @@
         </w:tc>
       </w:tr>
       <w:tr>
-        <w:tblPrEx>
-          <w:tblCellMar>
-            <w:top w:w="0" w:type="dxa"/>
-            <w:bottom w:w="0" w:type="dxa"/>
-          </w:tblCellMar>
-        </w:tblPrEx>
         <w:trPr>
           <w:cantSplit/>
         </w:trPr>
@@ -20563,12 +19378,6 @@
         </w:tc>
       </w:tr>
       <w:tr>
-        <w:tblPrEx>
-          <w:tblCellMar>
-            <w:top w:w="0" w:type="dxa"/>
-            <w:bottom w:w="0" w:type="dxa"/>
-          </w:tblCellMar>
-        </w:tblPrEx>
         <w:trPr>
           <w:cantSplit/>
         </w:trPr>
@@ -20654,12 +19463,6 @@
         </w:tc>
       </w:tr>
       <w:tr>
-        <w:tblPrEx>
-          <w:tblCellMar>
-            <w:top w:w="0" w:type="dxa"/>
-            <w:bottom w:w="0" w:type="dxa"/>
-          </w:tblCellMar>
-        </w:tblPrEx>
         <w:trPr>
           <w:cantSplit/>
         </w:trPr>
@@ -20745,12 +19548,6 @@
         </w:tc>
       </w:tr>
       <w:tr>
-        <w:tblPrEx>
-          <w:tblCellMar>
-            <w:top w:w="0" w:type="dxa"/>
-            <w:bottom w:w="0" w:type="dxa"/>
-          </w:tblCellMar>
-        </w:tblPrEx>
         <w:trPr>
           <w:cantSplit/>
         </w:trPr>
@@ -20879,12 +19676,6 @@
         <w:gridCol w:w="3500"/>
       </w:tblGrid>
       <w:tr>
-        <w:tblPrEx>
-          <w:tblCellMar>
-            <w:top w:w="0" w:type="dxa"/>
-            <w:bottom w:w="0" w:type="dxa"/>
-          </w:tblCellMar>
-        </w:tblPrEx>
         <w:trPr>
           <w:cantSplit/>
         </w:trPr>
@@ -20959,12 +19750,6 @@
         </w:tc>
       </w:tr>
       <w:tr>
-        <w:tblPrEx>
-          <w:tblCellMar>
-            <w:top w:w="0" w:type="dxa"/>
-            <w:bottom w:w="0" w:type="dxa"/>
-          </w:tblCellMar>
-        </w:tblPrEx>
         <w:trPr>
           <w:cantSplit/>
         </w:trPr>
@@ -21030,12 +19815,6 @@
         </w:tc>
       </w:tr>
       <w:tr>
-        <w:tblPrEx>
-          <w:tblCellMar>
-            <w:top w:w="0" w:type="dxa"/>
-            <w:bottom w:w="0" w:type="dxa"/>
-          </w:tblCellMar>
-        </w:tblPrEx>
         <w:trPr>
           <w:cantSplit/>
         </w:trPr>
@@ -21101,12 +19880,6 @@
         </w:tc>
       </w:tr>
       <w:tr>
-        <w:tblPrEx>
-          <w:tblCellMar>
-            <w:top w:w="0" w:type="dxa"/>
-            <w:bottom w:w="0" w:type="dxa"/>
-          </w:tblCellMar>
-        </w:tblPrEx>
         <w:trPr>
           <w:cantSplit/>
         </w:trPr>
@@ -21172,12 +19945,6 @@
         </w:tc>
       </w:tr>
       <w:tr>
-        <w:tblPrEx>
-          <w:tblCellMar>
-            <w:top w:w="0" w:type="dxa"/>
-            <w:bottom w:w="0" w:type="dxa"/>
-          </w:tblCellMar>
-        </w:tblPrEx>
         <w:trPr>
           <w:cantSplit/>
         </w:trPr>
@@ -21244,12 +20011,6 @@
         </w:tc>
       </w:tr>
       <w:tr>
-        <w:tblPrEx>
-          <w:tblCellMar>
-            <w:top w:w="0" w:type="dxa"/>
-            <w:bottom w:w="0" w:type="dxa"/>
-          </w:tblCellMar>
-        </w:tblPrEx>
         <w:trPr>
           <w:cantSplit/>
         </w:trPr>
@@ -21478,12 +20239,6 @@
         <w:gridCol w:w="2500"/>
       </w:tblGrid>
       <w:tr>
-        <w:tblPrEx>
-          <w:tblCellMar>
-            <w:top w:w="0" w:type="dxa"/>
-            <w:bottom w:w="0" w:type="dxa"/>
-          </w:tblCellMar>
-        </w:tblPrEx>
         <w:trPr>
           <w:cantSplit/>
         </w:trPr>
@@ -21581,12 +20336,6 @@
         </w:tc>
       </w:tr>
       <w:tr>
-        <w:tblPrEx>
-          <w:tblCellMar>
-            <w:top w:w="0" w:type="dxa"/>
-            <w:bottom w:w="0" w:type="dxa"/>
-          </w:tblCellMar>
-        </w:tblPrEx>
         <w:trPr>
           <w:cantSplit/>
         </w:trPr>
@@ -21672,12 +20421,6 @@
         </w:tc>
       </w:tr>
       <w:tr>
-        <w:tblPrEx>
-          <w:tblCellMar>
-            <w:top w:w="0" w:type="dxa"/>
-            <w:bottom w:w="0" w:type="dxa"/>
-          </w:tblCellMar>
-        </w:tblPrEx>
         <w:trPr>
           <w:cantSplit/>
         </w:trPr>
@@ -21763,12 +20506,6 @@
         </w:tc>
       </w:tr>
       <w:tr>
-        <w:tblPrEx>
-          <w:tblCellMar>
-            <w:top w:w="0" w:type="dxa"/>
-            <w:bottom w:w="0" w:type="dxa"/>
-          </w:tblCellMar>
-        </w:tblPrEx>
         <w:trPr>
           <w:cantSplit/>
         </w:trPr>
@@ -21854,12 +20591,6 @@
         </w:tc>
       </w:tr>
       <w:tr>
-        <w:tblPrEx>
-          <w:tblCellMar>
-            <w:top w:w="0" w:type="dxa"/>
-            <w:bottom w:w="0" w:type="dxa"/>
-          </w:tblCellMar>
-        </w:tblPrEx>
         <w:trPr>
           <w:cantSplit/>
         </w:trPr>
@@ -21945,12 +20676,6 @@
         </w:tc>
       </w:tr>
       <w:tr>
-        <w:tblPrEx>
-          <w:tblCellMar>
-            <w:top w:w="0" w:type="dxa"/>
-            <w:bottom w:w="0" w:type="dxa"/>
-          </w:tblCellMar>
-        </w:tblPrEx>
         <w:trPr>
           <w:cantSplit/>
         </w:trPr>
@@ -22261,7 +20986,7 @@
         <w:rFonts w:ascii="Calibri" w:eastAsia="Calibri" w:hAnsi="Calibri" w:cs="Calibri"/>
         <w:sz w:val="22"/>
         <w:szCs w:val="22"/>
-        <w:lang w:val="en-UG" w:eastAsia="en-UG" w:bidi="ar-SA"/>
+        <w:lang w:bidi="ar-SA"/>
       </w:rPr>
     </w:rPrDefault>
     <w:pPrDefault/>
@@ -22737,6 +21462,7 @@
   <w:style w:type="character" w:default="1" w:styleId="DefaultParagraphFont">
     <w:name w:val="Default Paragraph Font"/>
     <w:uiPriority w:val="1"/>
+    <w:semiHidden/>
     <w:unhideWhenUsed/>
   </w:style>
   <w:style w:type="table" w:default="1" w:styleId="TableNormal">

</xml_diff>